<commit_message>
Add report screenshots to the Word evidence document
Append "Appendix A. Report Screenshots" to Security_Testing_Evidence.docx:
the results-summary figure and the full report, sliced into four readable
page-width strips. Add a PNG-dimension reader so embedded images keep their
true aspect ratio, and regenerate the PDF preview.

Co-Authored-By: Claude Opus 4.8 <noreply@anthropic.com>
Claude-Session: https://claude.ai/code/session_018NQtD7nrYJ7KT1LgcYfGiW
</commit_message>
<xml_diff>
--- a/docs/security-evidence/Security_Testing_Evidence.docx
+++ b/docs/security-evidence/Security_Testing_Evidence.docx
@@ -5941,6 +5941,348 @@
           <w:szCs w:val="19"/>
         </w:rPr>
         <w:t xml:space="preserve">Honesty note for your defense: this is a defensive self-assessment run in-process against the project’s own application, not an external penetration engagement. Where the test plan names an external tool (ZAP, SQLMap, Hydra), the suite reproduces the check that tool performs against the live controls. State this plainly in Chapter 3 so the scope is clear; it strengthens, rather than weakens, the work.</w:t>
+      </w:r>
+    </w:p>
+    <w:p>
+      <w:r>
+        <w:br w:type="page"/>
+      </w:r>
+    </w:p>
+    <w:p>
+      <w:pPr>
+        <w:pStyle w:val="Heading1"/>
+        <w:spacing w:after="120" w:before="280"/>
+      </w:pPr>
+      <w:r>
+        <w:rPr>
+          <w:b/>
+          <w:bCs/>
+          <w:color w:val="1D4ED8"/>
+          <w:sz w:val="28"/>
+          <w:szCs w:val="28"/>
+        </w:rPr>
+        <w:t xml:space="preserve">Appendix A. Report Screenshots</w:t>
+      </w:r>
+    </w:p>
+    <w:p>
+      <w:pPr>
+        <w:spacing w:after="140"/>
+      </w:pPr>
+      <w:r>
+        <w:rPr>
+          <w:sz w:val="20"/>
+          <w:szCs w:val="20"/>
+        </w:rPr>
+        <w:t xml:space="preserve">Screenshots of the automated evidence report (report.html), produced by the test run. The full report is reproduced across the following strips at readable width.</w:t>
+      </w:r>
+    </w:p>
+    <w:p>
+      <w:pPr>
+        <w:pStyle w:val="Heading2"/>
+        <w:spacing w:after="100" w:before="220"/>
+      </w:pPr>
+      <w:r>
+        <w:rPr>
+          <w:b/>
+          <w:bCs/>
+          <w:color w:val="1F2937"/>
+          <w:sz w:val="24"/>
+          <w:szCs w:val="24"/>
+        </w:rPr>
+        <w:t xml:space="preserve">A.1  Results summary</w:t>
+      </w:r>
+    </w:p>
+    <w:p>
+      <w:pPr>
+        <w:jc w:val="center"/>
+      </w:pPr>
+      <w:r>
+        <w:drawing>
+          <wp:inline distT="0" distB="0" distL="0" distR="0">
+            <wp:extent cx="5715000" cy="4686300"/>
+            <wp:effectExtent t="0" r="0" b="0" l="0"/>
+            <wp:docPr id="1" name="" descr="" title=""/>
+            <wp:cNvGraphicFramePr>
+              <a:graphicFrameLocks xmlns:a="http://schemas.openxmlformats.org/drawingml/2006/main" noChangeAspect="1"/>
+            </wp:cNvGraphicFramePr>
+            <a:graphic xmlns:a="http://schemas.openxmlformats.org/drawingml/2006/main">
+              <a:graphicData uri="http://schemas.openxmlformats.org/drawingml/2006/picture">
+                <pic:pic xmlns:pic="http://schemas.openxmlformats.org/drawingml/2006/picture">
+                  <pic:nvPicPr>
+                    <pic:cNvPr id="0" name="" descr=""/>
+                    <pic:cNvPicPr>
+                      <a:picLocks noChangeAspect="1" noChangeArrowheads="1"/>
+                    </pic:cNvPicPr>
+                  </pic:nvPicPr>
+                  <pic:blipFill>
+                    <a:blip r:embed="rId7" cstate="none"/>
+                    <a:srcRect/>
+                    <a:stretch>
+                      <a:fillRect/>
+                    </a:stretch>
+                  </pic:blipFill>
+                  <pic:spPr bwMode="auto">
+                    <a:xfrm>
+                      <a:off x="0" y="0"/>
+                      <a:ext cx="5715000" cy="4686300"/>
+                    </a:xfrm>
+                    <a:prstGeom prst="rect">
+                      <a:avLst/>
+                    </a:prstGeom>
+                  </pic:spPr>
+                </pic:pic>
+              </a:graphicData>
+            </a:graphic>
+          </wp:inline>
+        </w:drawing>
+      </w:r>
+    </w:p>
+    <w:p>
+      <w:pPr>
+        <w:spacing w:after="160" w:before="40"/>
+        <w:jc w:val="center"/>
+      </w:pPr>
+      <w:r>
+        <w:rPr>
+          <w:i/>
+          <w:iCs/>
+          <w:color w:val="6B7280"/>
+          <w:sz w:val="18"/>
+          <w:szCs w:val="18"/>
+        </w:rPr>
+        <w:t xml:space="preserve">Figure A1. Evidence report — header and results-by-scenario table.</w:t>
+      </w:r>
+    </w:p>
+    <w:p>
+      <w:pPr>
+        <w:pStyle w:val="Heading2"/>
+        <w:spacing w:after="100" w:before="220"/>
+      </w:pPr>
+      <w:r>
+        <w:rPr>
+          <w:b/>
+          <w:bCs/>
+          <w:color w:val="1F2937"/>
+          <w:sz w:val="24"/>
+          <w:szCs w:val="24"/>
+        </w:rPr>
+        <w:t xml:space="preserve">A.2  Full report</w:t>
+      </w:r>
+    </w:p>
+    <w:p>
+      <w:pPr>
+        <w:jc w:val="center"/>
+      </w:pPr>
+      <w:r>
+        <w:drawing>
+          <wp:inline distT="0" distB="0" distL="0" distR="0">
+            <wp:extent cx="5715000" cy="7296150"/>
+            <wp:effectExtent t="0" r="0" b="0" l="0"/>
+            <wp:docPr id="1" name="" descr="" title=""/>
+            <wp:cNvGraphicFramePr>
+              <a:graphicFrameLocks xmlns:a="http://schemas.openxmlformats.org/drawingml/2006/main" noChangeAspect="1"/>
+            </wp:cNvGraphicFramePr>
+            <a:graphic xmlns:a="http://schemas.openxmlformats.org/drawingml/2006/main">
+              <a:graphicData uri="http://schemas.openxmlformats.org/drawingml/2006/picture">
+                <pic:pic xmlns:pic="http://schemas.openxmlformats.org/drawingml/2006/picture">
+                  <pic:nvPicPr>
+                    <pic:cNvPr id="0" name="" descr=""/>
+                    <pic:cNvPicPr>
+                      <a:picLocks noChangeAspect="1" noChangeArrowheads="1"/>
+                    </pic:cNvPicPr>
+                  </pic:nvPicPr>
+                  <pic:blipFill>
+                    <a:blip r:embed="rId8" cstate="none"/>
+                    <a:srcRect/>
+                    <a:stretch>
+                      <a:fillRect/>
+                    </a:stretch>
+                  </pic:blipFill>
+                  <pic:spPr bwMode="auto">
+                    <a:xfrm>
+                      <a:off x="0" y="0"/>
+                      <a:ext cx="5715000" cy="7296150"/>
+                    </a:xfrm>
+                    <a:prstGeom prst="rect">
+                      <a:avLst/>
+                    </a:prstGeom>
+                  </pic:spPr>
+                </pic:pic>
+              </a:graphicData>
+            </a:graphic>
+          </wp:inline>
+        </w:drawing>
+      </w:r>
+    </w:p>
+    <w:p>
+      <w:pPr>
+        <w:spacing w:after="40"/>
+      </w:pPr>
+    </w:p>
+    <w:p>
+      <w:pPr>
+        <w:jc w:val="center"/>
+      </w:pPr>
+      <w:r>
+        <w:drawing>
+          <wp:inline distT="0" distB="0" distL="0" distR="0">
+            <wp:extent cx="5715000" cy="7296150"/>
+            <wp:effectExtent t="0" r="0" b="0" l="0"/>
+            <wp:docPr id="1" name="" descr="" title=""/>
+            <wp:cNvGraphicFramePr>
+              <a:graphicFrameLocks xmlns:a="http://schemas.openxmlformats.org/drawingml/2006/main" noChangeAspect="1"/>
+            </wp:cNvGraphicFramePr>
+            <a:graphic xmlns:a="http://schemas.openxmlformats.org/drawingml/2006/main">
+              <a:graphicData uri="http://schemas.openxmlformats.org/drawingml/2006/picture">
+                <pic:pic xmlns:pic="http://schemas.openxmlformats.org/drawingml/2006/picture">
+                  <pic:nvPicPr>
+                    <pic:cNvPr id="0" name="" descr=""/>
+                    <pic:cNvPicPr>
+                      <a:picLocks noChangeAspect="1" noChangeArrowheads="1"/>
+                    </pic:cNvPicPr>
+                  </pic:nvPicPr>
+                  <pic:blipFill>
+                    <a:blip r:embed="rId9" cstate="none"/>
+                    <a:srcRect/>
+                    <a:stretch>
+                      <a:fillRect/>
+                    </a:stretch>
+                  </pic:blipFill>
+                  <pic:spPr bwMode="auto">
+                    <a:xfrm>
+                      <a:off x="0" y="0"/>
+                      <a:ext cx="5715000" cy="7296150"/>
+                    </a:xfrm>
+                    <a:prstGeom prst="rect">
+                      <a:avLst/>
+                    </a:prstGeom>
+                  </pic:spPr>
+                </pic:pic>
+              </a:graphicData>
+            </a:graphic>
+          </wp:inline>
+        </w:drawing>
+      </w:r>
+    </w:p>
+    <w:p>
+      <w:pPr>
+        <w:spacing w:after="40"/>
+      </w:pPr>
+    </w:p>
+    <w:p>
+      <w:pPr>
+        <w:jc w:val="center"/>
+      </w:pPr>
+      <w:r>
+        <w:drawing>
+          <wp:inline distT="0" distB="0" distL="0" distR="0">
+            <wp:extent cx="5715000" cy="7296150"/>
+            <wp:effectExtent t="0" r="0" b="0" l="0"/>
+            <wp:docPr id="1" name="" descr="" title=""/>
+            <wp:cNvGraphicFramePr>
+              <a:graphicFrameLocks xmlns:a="http://schemas.openxmlformats.org/drawingml/2006/main" noChangeAspect="1"/>
+            </wp:cNvGraphicFramePr>
+            <a:graphic xmlns:a="http://schemas.openxmlformats.org/drawingml/2006/main">
+              <a:graphicData uri="http://schemas.openxmlformats.org/drawingml/2006/picture">
+                <pic:pic xmlns:pic="http://schemas.openxmlformats.org/drawingml/2006/picture">
+                  <pic:nvPicPr>
+                    <pic:cNvPr id="0" name="" descr=""/>
+                    <pic:cNvPicPr>
+                      <a:picLocks noChangeAspect="1" noChangeArrowheads="1"/>
+                    </pic:cNvPicPr>
+                  </pic:nvPicPr>
+                  <pic:blipFill>
+                    <a:blip r:embed="rId10" cstate="none"/>
+                    <a:srcRect/>
+                    <a:stretch>
+                      <a:fillRect/>
+                    </a:stretch>
+                  </pic:blipFill>
+                  <pic:spPr bwMode="auto">
+                    <a:xfrm>
+                      <a:off x="0" y="0"/>
+                      <a:ext cx="5715000" cy="7296150"/>
+                    </a:xfrm>
+                    <a:prstGeom prst="rect">
+                      <a:avLst/>
+                    </a:prstGeom>
+                  </pic:spPr>
+                </pic:pic>
+              </a:graphicData>
+            </a:graphic>
+          </wp:inline>
+        </w:drawing>
+      </w:r>
+    </w:p>
+    <w:p>
+      <w:pPr>
+        <w:spacing w:after="40"/>
+      </w:pPr>
+    </w:p>
+    <w:p>
+      <w:pPr>
+        <w:jc w:val="center"/>
+      </w:pPr>
+      <w:r>
+        <w:drawing>
+          <wp:inline distT="0" distB="0" distL="0" distR="0">
+            <wp:extent cx="5715000" cy="1438275"/>
+            <wp:effectExtent t="0" r="0" b="0" l="0"/>
+            <wp:docPr id="1" name="" descr="" title=""/>
+            <wp:cNvGraphicFramePr>
+              <a:graphicFrameLocks xmlns:a="http://schemas.openxmlformats.org/drawingml/2006/main" noChangeAspect="1"/>
+            </wp:cNvGraphicFramePr>
+            <a:graphic xmlns:a="http://schemas.openxmlformats.org/drawingml/2006/main">
+              <a:graphicData uri="http://schemas.openxmlformats.org/drawingml/2006/picture">
+                <pic:pic xmlns:pic="http://schemas.openxmlformats.org/drawingml/2006/picture">
+                  <pic:nvPicPr>
+                    <pic:cNvPr id="0" name="" descr=""/>
+                    <pic:cNvPicPr>
+                      <a:picLocks noChangeAspect="1" noChangeArrowheads="1"/>
+                    </pic:cNvPicPr>
+                  </pic:nvPicPr>
+                  <pic:blipFill>
+                    <a:blip r:embed="rId11" cstate="none"/>
+                    <a:srcRect/>
+                    <a:stretch>
+                      <a:fillRect/>
+                    </a:stretch>
+                  </pic:blipFill>
+                  <pic:spPr bwMode="auto">
+                    <a:xfrm>
+                      <a:off x="0" y="0"/>
+                      <a:ext cx="5715000" cy="1438275"/>
+                    </a:xfrm>
+                    <a:prstGeom prst="rect">
+                      <a:avLst/>
+                    </a:prstGeom>
+                  </pic:spPr>
+                </pic:pic>
+              </a:graphicData>
+            </a:graphic>
+          </wp:inline>
+        </w:drawing>
+      </w:r>
+    </w:p>
+    <w:p>
+      <w:pPr>
+        <w:spacing w:after="40"/>
+      </w:pPr>
+    </w:p>
+    <w:p>
+      <w:pPr>
+        <w:spacing w:before="40"/>
+        <w:jc w:val="center"/>
+      </w:pPr>
+      <w:r>
+        <w:rPr>
+          <w:i/>
+          <w:iCs/>
+          <w:color w:val="6B7280"/>
+          <w:sz w:val="18"/>
+          <w:szCs w:val="18"/>
+        </w:rPr>
+        <w:t xml:space="preserve">Figure A2. Full evidence report (continuous, shown in sequential strips).</w:t>
       </w:r>
     </w:p>
     <w:sectPr>

</xml_diff>